<commit_message>
Run sub-item numbers into the paragraph, as the earlier draft did
Numbers like 1.4.6.2 and 1.5.1 were sitting alone on their own line with the
text beneath them. In the version handed in earlier they lead the paragraph
they belong to, on the same line, and that is what the reader expects.

Headings that carry a title, 1.4.1 สถาปัตยกรรมระบบแบบ 3 ชั้น for instance,
stay as bold headings; only the number-only ones merge into their paragraph.
The (1) (2) (3) items under 1.6.1 were being parsed as a list, which hung
their wrapped lines under the text instead of returning them to the left
margin, so they are now plain paragraphs.

The merging happens while converting, so the Markdown keeps its heading
structure.

Co-Authored-By: Claude Opus 5 <noreply@anthropic.com>
Claude-Session: https://claude.ai/code/session_01VK1RWMhqrGAHMFf4HNf3qn
</commit_message>
<xml_diff>
--- a/Documents/รูปเล่ม/บทที่1_ฉบับตรวจแก้.docx
+++ b/Documents/รูปเล่ม/บทที่1_ฉบับตรวจแก้.docx
@@ -2,7 +2,7 @@
 <file path=word/document.xml><?xml version="1.0" encoding="utf-8"?>
 <w:document xmlns:w="http://schemas.openxmlformats.org/wordprocessingml/2006/main" xmlns:m="http://schemas.openxmlformats.org/officeDocument/2006/math" xmlns:r="http://schemas.openxmlformats.org/officeDocument/2006/relationships" xmlns:o="urn:schemas-microsoft-com:office:office" xmlns:v="urn:schemas-microsoft-com:vml" xmlns:w10="urn:schemas-microsoft-com:office:word" xmlns:a="http://schemas.openxmlformats.org/drawingml/2006/main" xmlns:pic="http://schemas.openxmlformats.org/drawingml/2006/picture" xmlns:wp="http://schemas.openxmlformats.org/drawingml/2006/wordprocessingDrawing">
   <w:body>
-    <w:bookmarkStart w:id="50" w:name="บทท-1"/>
+    <w:bookmarkStart w:id="23" w:name="บทท-1"/>
     <w:p>
       <w:pPr>
         <w:pStyle w:val="Heading1"/>
@@ -87,7 +87,7 @@
       </w:r>
     </w:p>
     <w:bookmarkEnd w:id="10"/>
-    <w:bookmarkStart w:id="15" w:name="วตถประสงคของโครงงานวศวกรรม"/>
+    <w:bookmarkStart w:id="11" w:name="วตถประสงคของโครงงานวศวกรรม"/>
     <w:p>
       <w:pPr>
         <w:pStyle w:val="Heading2"/>
@@ -96,13 +96,113 @@
         <w:t xml:space="preserve">1.2 วัตถุประสงค์ของโครงงานวิศวกรรม</w:t>
       </w:r>
     </w:p>
-    <w:bookmarkStart w:id="11" w:name="section"/>
+    <w:p>
+      <w:pPr>
+        <w:pStyle w:val="FirstParagraph"/>
+      </w:pPr>
+      <w:r>
+        <w:t xml:space="preserve">1.2.1 เพื่อลดข้อผิดพลาดในกระบวนการบันทึกการขายและจัดการสินค้าคงคลัง อันเกิดจากการพึ่งพาเอกสารกระดาษที่ไม่มีการยืนยันโดยระบบ</w:t>
+      </w:r>
+    </w:p>
+    <w:p>
+      <w:pPr>
+        <w:pStyle w:val="BodyText"/>
+      </w:pPr>
+      <w:r>
+        <w:t xml:space="preserve">1.2.2 เพื่อลดระยะเวลารอคอยของลูกค้า โดยให้พนักงานคลังสินค้าสามารถรับข้อมูลคำสั่งซื้อและเริ่มจัดเตรียมสินค้าได้ทันทีที่ชำระเงิน โดยไม่ต้องรอให้ลูกค้าเดินมาถึงจุดรับของ</w:t>
+      </w:r>
+    </w:p>
+    <w:p>
+      <w:pPr>
+        <w:pStyle w:val="BodyText"/>
+      </w:pPr>
+      <w:r>
+        <w:t xml:space="preserve">1.2.3 เพื่อให้ยอดสินค้าคงเหลือในระบบสะท้อนจำนวนสินค้าจริงในคลังได้อย่างแม่นยำ และป้องกันการรับสินค้าซ้ำด้วยการควบคุมสถานะคำสั่งซื้อผ่านระบบ</w:t>
+      </w:r>
+    </w:p>
+    <w:p>
+      <w:pPr>
+        <w:pStyle w:val="BodyText"/>
+      </w:pPr>
+      <w:r>
+        <w:t xml:space="preserve">1.2.4 เพื่อให้ผู้บริหารสามารถติดตามสถานะยอดขาย สต็อก และคิวงานได้แบบเรียลไทม์ และตัดสินใจสั่งซื้อสินค้าได้จากข้อมูลจริง แทนการใช้ประสบการณ์และสัญชาตญาณ</w:t>
+      </w:r>
+    </w:p>
+    <w:bookmarkEnd w:id="11"/>
+    <w:bookmarkStart w:id="12" w:name="ขอบเขตของโครงงานวศวกรรม"/>
+    <w:p>
+      <w:pPr>
+        <w:pStyle w:val="Heading2"/>
+      </w:pPr>
+      <w:r>
+        <w:t xml:space="preserve">1.3 ขอบเขตของโครงงานวิศวกรรม</w:t>
+      </w:r>
+    </w:p>
+    <w:p>
+      <w:pPr>
+        <w:pStyle w:val="FirstParagraph"/>
+      </w:pPr>
+      <w:r>
+        <w:t xml:space="preserve">1.3.1 พัฒนาเว็บแอปพลิเคชันรูปแบบ Responsive Design รองรับการใช้งานผ่านคอมพิวเตอร์และอุปกรณ์เคลื่อนที่ ครอบคลุมผู้ใช้งาน 3 บทบาทหลัก ได้แก่ พนักงานขาย พนักงานคลังสินค้า และผู้จัดการ</w:t>
+      </w:r>
+    </w:p>
+    <w:p>
+      <w:pPr>
+        <w:pStyle w:val="BodyText"/>
+      </w:pPr>
+      <w:r>
+        <w:t xml:space="preserve">1.3.2 พัฒนาระบบลงชื่อเข้าใช้งาน การควบคุมสิทธิ์ตามบทบาท (Role-Based Access Control: RBAC) และการจัดการข้อมูลสินค้าคงคลัง (Product Master) รวมถึงการตั้งค่าจุดสั่งซื้อเพิ่ม (Reorder Point)</w:t>
+      </w:r>
+    </w:p>
+    <w:p>
+      <w:pPr>
+        <w:pStyle w:val="BodyText"/>
+      </w:pPr>
+      <w:r>
+        <w:t xml:space="preserve">1.3.3 พัฒนาระบบรับชำระเงินผ่าน QR พร้อมเพย์ (PromptPay) และเมื่อพนักงานยืนยันรับเงินแล้ว ระบบพิมพ์ใบเสร็จกระดาษผ่านเครื่องพิมพ์ใบเสร็จความร้อน (Thermal Receipt Printer) พร้อมส่งคำสั่งซื้อเข้าคิวคลังสินค้าแบบเรียลไทม์ทันที</w:t>
+      </w:r>
+    </w:p>
+    <w:p>
+      <w:pPr>
+        <w:pStyle w:val="BodyText"/>
+      </w:pPr>
+      <w:r>
+        <w:t xml:space="preserve">1.3.4 พัฒนาระบบจัดการคลังสินค้าแบบเรียลไทม์ แสดงคิวรอจ่ายสินค้าทันทีที่ลูกค้าชำระเงิน และให้พนักงานยืนยันจ่ายสินค้าพร้อมตัดสต็อกแบบอะตอมมิก (Atomic Stock Deduction)</w:t>
+      </w:r>
+    </w:p>
+    <w:p>
+      <w:pPr>
+        <w:pStyle w:val="BodyText"/>
+      </w:pPr>
+      <w:r>
+        <w:t xml:space="preserve">1.3.5 พัฒนาแดชบอร์ดปฏิบัติการ (Operational Dashboard) แสดงสถิติยอดขายและสต็อก ระบบบันทึกประวัติการทำรายการ (Audit Logs) และระบบแจ้งเตือนภายในแอปพลิเคชัน (In-App Notification)</w:t>
+      </w:r>
+    </w:p>
+    <w:p>
+      <w:pPr>
+        <w:pStyle w:val="BodyText"/>
+      </w:pPr>
+      <w:r>
+        <w:t xml:space="preserve">1.3.6 โครงงานนี้ไม่ครอบคลุมระบบบัญชีเต็มรูปแบบ การชำระเงินผ่าน Payment Gateway หรือเครื่องรูดบัตร (EDC) ภายนอก การตรวจสอบสถานะการชำระเงินอัตโนมัติผ่าน API ของธนาคาร การพัฒนาแอปพลิเคชันแบบ Mobile Native การเชื่อมต่อระบบ ERP หรือซัพพลายเออร์ภายนอกแบบอัตโนมัติ และการแจ้งเตือนผ่านบริการภายนอก เช่น LINE Notify หรือ Email ส่วนโมดูล AI-Assisted ถือเป็น Future Work ที่ไม่อยู่ในขอบเขตของโครงงานนี้</w:t>
+      </w:r>
+    </w:p>
+    <w:bookmarkEnd w:id="12"/>
+    <w:bookmarkStart w:id="19" w:name="สมมตฐานของโครงงานวศวกรรม"/>
+    <w:p>
+      <w:pPr>
+        <w:pStyle w:val="Heading2"/>
+      </w:pPr>
+      <w:r>
+        <w:t xml:space="preserve">1.4 สมมติฐานของโครงงานวิศวกรรม</w:t>
+      </w:r>
+    </w:p>
+    <w:bookmarkStart w:id="13" w:name="X6c45b262d3e01ab68b3da831d7eb3bda5aa27c4"/>
     <w:p>
       <w:pPr>
         <w:pStyle w:val="Heading3"/>
       </w:pPr>
       <w:r>
-        <w:t xml:space="preserve">1.2.1</w:t>
+        <w:t xml:space="preserve">1.4.1 สถาปัตยกรรมระบบแบบ 3 ชั้น (3-Tier Architecture)</w:t>
       </w:r>
     </w:p>
     <w:p>
@@ -110,17 +210,25 @@
         <w:pStyle w:val="FirstParagraph"/>
       </w:pPr>
       <w:r>
-        <w:t xml:space="preserve">เพื่อลดข้อผิดพลาดในกระบวนการบันทึกการขายและจัดการสินค้าคงคลัง อันเกิดจากการพึ่งพาเอกสารกระดาษที่ไม่มีการยืนยันโดยระบบ</w:t>
-      </w:r>
-    </w:p>
-    <w:bookmarkEnd w:id="11"/>
-    <w:bookmarkStart w:id="12" w:name="section-1"/>
+        <w:t xml:space="preserve">1.4.1.1 ระบบถูกออกแบบแยกส่วนประกอบออกเป็น Presentation Layer, Application/Business Logic Layer และ Data Layer ตามหลักการแยกความรับผิดชอบ (Separation of Concerns)</w:t>
+      </w:r>
+    </w:p>
+    <w:p>
+      <w:pPr>
+        <w:pStyle w:val="BodyText"/>
+      </w:pPr>
+      <w:r>
+        <w:t xml:space="preserve">1.4.1.2 การแยกส่วนดังกล่าวช่วยให้การพัฒนา การทดสอบ และการบำรุงรักษาระบบในระยะยาวทำได้ง่ายและเป็นระบบมากขึ้น โดยทวนสอบได้จากการที่แต่ละส่วนประกอบสามารถทดสอบแยกจากกันได้โดยไม่ต้องเปิดระบบทั้งหมด</w:t>
+      </w:r>
+    </w:p>
+    <w:bookmarkEnd w:id="13"/>
+    <w:bookmarkStart w:id="14" w:name="ระบบฐานขอมลและคณสมบต-acid"/>
     <w:p>
       <w:pPr>
         <w:pStyle w:val="Heading3"/>
       </w:pPr>
       <w:r>
-        <w:t xml:space="preserve">1.2.2</w:t>
+        <w:t xml:space="preserve">1.4.2 ระบบฐานข้อมูลและคุณสมบัติ ACID</w:t>
       </w:r>
     </w:p>
     <w:p>
@@ -128,17 +236,25 @@
         <w:pStyle w:val="FirstParagraph"/>
       </w:pPr>
       <w:r>
-        <w:t xml:space="preserve">เพื่อลดระยะเวลารอคอยของลูกค้า โดยให้พนักงานคลังสินค้าสามารถรับข้อมูลคำสั่งซื้อและเริ่มจัดเตรียมสินค้าได้ทันทีที่ชำระเงิน โดยไม่ต้องรอให้ลูกค้าเดินมาถึงจุดรับของ</w:t>
-      </w:r>
-    </w:p>
-    <w:bookmarkEnd w:id="12"/>
-    <w:bookmarkStart w:id="13" w:name="section-2"/>
+        <w:t xml:space="preserve">1.4.2.1 ใช้ฐานข้อมูลเชิงสัมพันธ์ (MySQL) ควบคุมด้วยหลักการ ACID (Atomicity, Consistency, Isolation, Durability) เพื่อรับประกันความสมบูรณ์ของข้อมูลสต็อก</w:t>
+      </w:r>
+    </w:p>
+    <w:p>
+      <w:pPr>
+        <w:pStyle w:val="BodyText"/>
+      </w:pPr>
+      <w:r>
+        <w:t xml:space="preserve">1.4.2.2 ธุรกรรมการตัดสต็อกทำงานแบบอะตอมมิก (Atomic Transaction) เพื่อป้องกันภาวะ Race Condition เมื่อมีการยืนยันจ่ายสินค้าพร้อมกันหลายรายการ และเมื่อธุรกรรมล้มเหลวกลางคัน การเปลี่ยนแปลงที่ทำไปแล้วบางส่วนต้องถูกย้อนกลับทั้งหมด</w:t>
+      </w:r>
+    </w:p>
+    <w:bookmarkEnd w:id="14"/>
+    <w:bookmarkStart w:id="15" w:name="การควบคมสถานะคำสงซอ-order-status-control"/>
     <w:p>
       <w:pPr>
         <w:pStyle w:val="Heading3"/>
       </w:pPr>
       <w:r>
-        <w:t xml:space="preserve">1.2.3</w:t>
+        <w:t xml:space="preserve">1.4.3 การควบคุมสถานะคำสั่งซื้อ (Order Status Control)</w:t>
       </w:r>
     </w:p>
     <w:p>
@@ -146,17 +262,43 @@
         <w:pStyle w:val="FirstParagraph"/>
       </w:pPr>
       <w:r>
-        <w:t xml:space="preserve">เพื่อให้ยอดสินค้าคงเหลือในระบบสะท้อนจำนวนสินค้าจริงในคลังได้อย่างแม่นยำ และป้องกันการรับสินค้าซ้ำด้วยการควบคุมสถานะคำสั่งซื้อผ่านระบบ</w:t>
-      </w:r>
-    </w:p>
-    <w:bookmarkEnd w:id="13"/>
-    <w:bookmarkStart w:id="14" w:name="section-3"/>
+        <w:t xml:space="preserve">1.4.3.1 ระบบใช้แนวคิดการจัดการสถานะข้อมูล (State Management) กำกับวงจรชีวิตของคำสั่งซื้อ ตั้งแต่สถานะ</w:t>
+      </w:r>
+      <w:r>
+        <w:t xml:space="preserve"> </w:t>
+      </w:r>
+      <w:r>
+        <w:t xml:space="preserve">“รอจ่ายสินค้า”</w:t>
+      </w:r>
+      <w:r>
+        <w:t xml:space="preserve"> </w:t>
+      </w:r>
+      <w:r>
+        <w:t xml:space="preserve">จนถึง</w:t>
+      </w:r>
+      <w:r>
+        <w:t xml:space="preserve"> </w:t>
+      </w:r>
+      <w:r>
+        <w:t xml:space="preserve">“ส่งมอบสำเร็จ”</w:t>
+      </w:r>
+    </w:p>
+    <w:p>
+      <w:pPr>
+        <w:pStyle w:val="BodyText"/>
+      </w:pPr>
+      <w:r>
+        <w:t xml:space="preserve">1.4.3.2 เมื่อพนักงานคลังสินค้ากดยืนยันจ่ายสินค้าแล้ว ระบบจะเปลี่ยนสถานะคำสั่งซื้อทันที และไม่แสดงในคิวรอจ่ายอีกต่อไป เพื่อป้องกันการรับสินค้าซ้ำ โดยไม่ต้องอาศัยการสแกนรหัสยืนยันเพิ่มเติม</w:t>
+      </w:r>
+    </w:p>
+    <w:bookmarkEnd w:id="15"/>
+    <w:bookmarkStart w:id="16" w:name="X951687ef2c64f4ad26e3e661a119d01a9a60ae5"/>
     <w:p>
       <w:pPr>
         <w:pStyle w:val="Heading3"/>
       </w:pPr>
       <w:r>
-        <w:t xml:space="preserve">1.2.4</w:t>
+        <w:t xml:space="preserve">1.4.4 การสื่อสารข้อมูลแบบเรียลไทม์ (Event-Driven Communication)</w:t>
       </w:r>
     </w:p>
     <w:p>
@@ -164,27 +306,86 @@
         <w:pStyle w:val="FirstParagraph"/>
       </w:pPr>
       <w:r>
-        <w:t xml:space="preserve">เพื่อให้ผู้บริหารสามารถติดตามสถานะยอดขาย สต็อก และคิวงานได้แบบเรียลไทม์ และตัดสินใจสั่งซื้อสินค้าได้จากข้อมูลจริง แทนการใช้ประสบการณ์และสัญชาตญาณ</w:t>
-      </w:r>
-    </w:p>
-    <w:bookmarkEnd w:id="14"/>
-    <w:bookmarkEnd w:id="15"/>
-    <w:bookmarkStart w:id="22" w:name="ขอบเขตของโครงงานวศวกรรม"/>
+        <w:t xml:space="preserve">1.4.4.1 เมื่อมีการยืนยันคำสั่งซื้อที่หน้าร้าน ข้อมูลจะถูกผลัก (Push) ไปยังหน้าจอคิวคลังสินค้าทันที โดยพนักงานไม่จำเป็นต้องกดรีเฟรชหน้าจอ และไม่ต้องให้หน้าจอวนถามข้อมูลเป็นระยะ (Polling)</w:t>
+      </w:r>
+    </w:p>
+    <w:p>
+      <w:pPr>
+        <w:pStyle w:val="BodyText"/>
+      </w:pPr>
+      <w:r>
+        <w:t xml:space="preserve">1.4.4.2 พนักงานคลังสินค้าสามารถทราบและเริ่มจัดเตรียมสินค้าได้ก่อนที่ลูกค้าจะเดินถือใบเสร็จมาถึงจุดรับของ</w:t>
+      </w:r>
+    </w:p>
+    <w:bookmarkEnd w:id="16"/>
+    <w:bookmarkStart w:id="17" w:name="Xcf2c9c4bec6e1a4096a5f6228cbb22e5db80628"/>
+    <w:p>
+      <w:pPr>
+        <w:pStyle w:val="Heading3"/>
+      </w:pPr>
+      <w:r>
+        <w:t xml:space="preserve">1.4.5 การนำเสนอข้อมูลเชิงปฏิบัติการ (Operational Dashboard &amp; In-App Alerts)</w:t>
+      </w:r>
+    </w:p>
+    <w:p>
+      <w:pPr>
+        <w:pStyle w:val="FirstParagraph"/>
+      </w:pPr>
+      <w:r>
+        <w:t xml:space="preserve">1.4.5.1 ระบบรวบรวมข้อมูลธุรกรรม (Data Aggregation) จากหลายแหล่งมาแสดงผลผ่าน Operational Dashboard ให้ผู้บริหารมองเห็นภาพรวมแบบเรียลไทม์</w:t>
+      </w:r>
+    </w:p>
+    <w:p>
+      <w:pPr>
+        <w:pStyle w:val="BodyText"/>
+      </w:pPr>
+      <w:r>
+        <w:t xml:space="preserve">1.4.5.2 ระบบแจ้งเตือนภายในแอปพลิเคชัน (In-App Notification) เมื่อสต็อกต่ำกว่าจุดสั่งซื้อเพิ่ม (Reorder Point) หรือมีคิวงานค้างนานผิดปกติ โดยไม่พึ่งพาบริการแจ้งเตือนภายนอก</w:t>
+      </w:r>
+    </w:p>
+    <w:bookmarkEnd w:id="17"/>
+    <w:bookmarkStart w:id="18" w:name="ผลลพธทคาดหวงจากการนำระบบไปใช"/>
+    <w:p>
+      <w:pPr>
+        <w:pStyle w:val="Heading3"/>
+      </w:pPr>
+      <w:r>
+        <w:t xml:space="preserve">1.4.6 ผลลัพธ์ที่คาดหวังจากการนำระบบไปใช้</w:t>
+      </w:r>
+    </w:p>
+    <w:p>
+      <w:pPr>
+        <w:pStyle w:val="FirstParagraph"/>
+      </w:pPr>
+      <w:r>
+        <w:t xml:space="preserve">1.4.6.1 การส่งคำสั่งซื้อเข้าคิวงานคลังสินค้าแบบเรียลไทม์ทันทีที่ชำระเงิน จะช่วยลดข้อผิดพลาดในการหยิบสินค้า เนื่องจากพนักงานอ่านรายการจากหน้าจอที่ระบบสร้างขึ้นแทนการอ่านลายมือบนใบเสร็จ และทำให้กระบวนการส่งมอบรวดเร็วขึ้นเพราะการจัดเตรียมสินค้าเริ่มได้ก่อนลูกค้าเดินมาถึงจุดรับของ</w:t>
+      </w:r>
+    </w:p>
+    <w:p>
+      <w:pPr>
+        <w:pStyle w:val="BodyText"/>
+      </w:pPr>
+      <w:r>
+        <w:t xml:space="preserve">1.4.6.2 การให้พนักงานยืนยันจ่ายสินค้าผ่านหน้าจอคิวงานเพื่อตัดสต็อกอัตโนมัติ จะทำให้ตัวเลขสต็อกในระบบตรงกับจำนวนสินค้าที่มีอยู่จริงในคลัง โดยตั้งเกณฑ์ว่าต้องไม่เกิดผลต่างที่มีสาเหตุจากตัวระบบเอง ซึ่งทวนสอบได้ด้วยการนับสินค้าจริงเปรียบเทียบกับยอดในระบบ</w:t>
+      </w:r>
+    </w:p>
+    <w:p>
+      <w:pPr>
+        <w:pStyle w:val="BodyText"/>
+      </w:pPr>
+      <w:r>
+        <w:t xml:space="preserve">1.4.6.3 การใช้ Operational Dashboard และระบบแจ้งเตือนภายในแอปพลิเคชัน จะช่วยให้ผู้บริหารมีข้อมูลจริง (Data-Driven) ในการวางแผนสั่งซื้อสินค้า ลดปัญหาสินค้าขาดมือและสินค้าค้างสต็อกที่เกิดจากการสั่งซื้อด้วยประสบการณ์เพียงอย่างเดียว</w:t>
+      </w:r>
+    </w:p>
+    <w:bookmarkEnd w:id="18"/>
+    <w:bookmarkEnd w:id="19"/>
+    <w:bookmarkStart w:id="20" w:name="ประโยชนทคาดวาจะไดรบ"/>
     <w:p>
       <w:pPr>
         <w:pStyle w:val="Heading2"/>
       </w:pPr>
       <w:r>
-        <w:t xml:space="preserve">1.3 ขอบเขตของโครงงานวิศวกรรม</w:t>
-      </w:r>
-    </w:p>
-    <w:bookmarkStart w:id="16" w:name="section-4"/>
-    <w:p>
-      <w:pPr>
-        <w:pStyle w:val="Heading3"/>
-      </w:pPr>
-      <w:r>
-        <w:t xml:space="preserve">1.3.1</w:t>
+        <w:t xml:space="preserve">1.5 ประโยชน์ที่คาดว่าจะได้รับ</w:t>
       </w:r>
     </w:p>
     <w:p>
@@ -192,17 +393,33 @@
         <w:pStyle w:val="FirstParagraph"/>
       </w:pPr>
       <w:r>
-        <w:t xml:space="preserve">พัฒนาเว็บแอปพลิเคชันรูปแบบ Responsive Design รองรับการใช้งานผ่านคอมพิวเตอร์และอุปกรณ์เคลื่อนที่ ครอบคลุมผู้ใช้งาน 3 บทบาทหลัก ได้แก่ พนักงานขาย พนักงานคลังสินค้า และผู้จัดการ</w:t>
-      </w:r>
-    </w:p>
-    <w:bookmarkEnd w:id="16"/>
-    <w:bookmarkStart w:id="17" w:name="section-5"/>
-    <w:p>
-      <w:pPr>
-        <w:pStyle w:val="Heading3"/>
-      </w:pPr>
-      <w:r>
-        <w:t xml:space="preserve">1.3.2</w:t>
+        <w:t xml:space="preserve">1.5.1 ลดระยะเวลารอคอย (Lead Time Reduction) โดยลดคอขวดระหว่างหน้าร้านและคลังสินค้าผ่านระบบคิวเรียลไทม์ ทำให้คลังสินค้าสามารถจัดเตรียมวัสดุล่วงหน้าได้ทันทีที่รับชำระเงิน</w:t>
+      </w:r>
+    </w:p>
+    <w:p>
+      <w:pPr>
+        <w:pStyle w:val="BodyText"/>
+      </w:pPr>
+      <w:r>
+        <w:t xml:space="preserve">1.5.2 ลดข้อผิดพลาดที่เกิดจากมนุษย์ (Human Error Reduction) โดยลดความเสี่ยงจากการอ่านเอกสารกระดาษผิดพลาด ระบบส่งรายละเอียดคำสั่งซื้อไปยังหน้าจอคลังสินค้าโดยตรงแบบเรียลไทม์ พนักงานจึงเตรียมและตรวจสอบสินค้าจากข้อมูลบนหน้าจอระบบ แทนการอ่านใบเสร็จด้วยสายตาเพียงอย่างเดียว</w:t>
+      </w:r>
+    </w:p>
+    <w:p>
+      <w:pPr>
+        <w:pStyle w:val="BodyText"/>
+      </w:pPr>
+      <w:r>
+        <w:t xml:space="preserve">1.5.3 เพิ่มความสมบูรณ์ของข้อมูล (Data Integrity) โดยยอดสินค้าคงเหลือในระบบสะท้อนจำนวนสินค้าจริงในคลังอย่างแม่นยำ พร้อมทั้งสามารถตรวจสอบย้อนหลัง (Traceability) ได้ทุกรายการ ซึ่งเป็นรากฐานให้ผู้บริหารสามารถวางแผนสั่งซื้อสินค้าจากข้อมูลจริง แทนการใช้ประสบการณ์และสัญชาตญาณ</w:t>
+      </w:r>
+    </w:p>
+    <w:bookmarkEnd w:id="20"/>
+    <w:bookmarkStart w:id="21" w:name="สถานทจดทำโครงงาน"/>
+    <w:p>
+      <w:pPr>
+        <w:pStyle w:val="Heading2"/>
+      </w:pPr>
+      <w:r>
+        <w:t xml:space="preserve">1.6 สถานที่จัดทำโครงงาน</w:t>
       </w:r>
     </w:p>
     <w:p>
@@ -210,531 +427,35 @@
         <w:pStyle w:val="FirstParagraph"/>
       </w:pPr>
       <w:r>
-        <w:t xml:space="preserve">พัฒนาระบบลงชื่อเข้าใช้งาน การควบคุมสิทธิ์ตามบทบาท (Role-Based Access Control: RBAC) และการจัดการข้อมูลสินค้าคงคลัง (Product Master) รวมถึงการตั้งค่าจุดสั่งซื้อเพิ่ม (Reorder Point)</w:t>
-      </w:r>
-    </w:p>
-    <w:bookmarkEnd w:id="17"/>
-    <w:bookmarkStart w:id="18" w:name="section-6"/>
-    <w:p>
-      <w:pPr>
-        <w:pStyle w:val="Heading3"/>
-      </w:pPr>
-      <w:r>
-        <w:t xml:space="preserve">1.3.3</w:t>
-      </w:r>
-    </w:p>
-    <w:p>
-      <w:pPr>
-        <w:pStyle w:val="FirstParagraph"/>
-      </w:pPr>
-      <w:r>
-        <w:t xml:space="preserve">พัฒนาระบบรับชำระเงินผ่าน QR พร้อมเพย์ (PromptPay) และเมื่อพนักงานยืนยันรับเงินแล้ว ระบบพิมพ์ใบเสร็จกระดาษผ่านเครื่องพิมพ์ใบเสร็จความร้อน (Thermal Receipt Printer) พร้อมส่งคำสั่งซื้อเข้าคิวคลังสินค้าแบบเรียลไทม์ทันที</w:t>
-      </w:r>
-    </w:p>
-    <w:bookmarkEnd w:id="18"/>
-    <w:bookmarkStart w:id="19" w:name="section-7"/>
-    <w:p>
-      <w:pPr>
-        <w:pStyle w:val="Heading3"/>
-      </w:pPr>
-      <w:r>
-        <w:t xml:space="preserve">1.3.4</w:t>
-      </w:r>
-    </w:p>
-    <w:p>
-      <w:pPr>
-        <w:pStyle w:val="FirstParagraph"/>
-      </w:pPr>
-      <w:r>
-        <w:t xml:space="preserve">พัฒนาระบบจัดการคลังสินค้าแบบเรียลไทม์ แสดงคิวรอจ่ายสินค้าทันทีที่ลูกค้าชำระเงิน และให้พนักงานยืนยันจ่ายสินค้าพร้อมตัดสต็อกแบบอะตอมมิก (Atomic Stock Deduction)</w:t>
-      </w:r>
-    </w:p>
-    <w:bookmarkEnd w:id="19"/>
-    <w:bookmarkStart w:id="20" w:name="section-8"/>
-    <w:p>
-      <w:pPr>
-        <w:pStyle w:val="Heading3"/>
-      </w:pPr>
-      <w:r>
-        <w:t xml:space="preserve">1.3.5</w:t>
-      </w:r>
-    </w:p>
-    <w:p>
-      <w:pPr>
-        <w:pStyle w:val="FirstParagraph"/>
-      </w:pPr>
-      <w:r>
-        <w:t xml:space="preserve">พัฒนาแดชบอร์ดปฏิบัติการ (Operational Dashboard) แสดงสถิติยอดขายและสต็อก ระบบบันทึกประวัติการทำรายการ (Audit Logs) และระบบแจ้งเตือนภายในแอปพลิเคชัน (In-App Notification)</w:t>
-      </w:r>
-    </w:p>
-    <w:bookmarkEnd w:id="20"/>
-    <w:bookmarkStart w:id="21" w:name="section-9"/>
-    <w:p>
-      <w:pPr>
-        <w:pStyle w:val="Heading3"/>
-      </w:pPr>
-      <w:r>
-        <w:t xml:space="preserve">1.3.6</w:t>
-      </w:r>
-    </w:p>
-    <w:p>
-      <w:pPr>
-        <w:pStyle w:val="FirstParagraph"/>
-      </w:pPr>
-      <w:r>
-        <w:t xml:space="preserve">โครงงานนี้ไม่ครอบคลุมระบบบัญชีเต็มรูปแบบ การชำระเงินผ่าน Payment Gateway หรือเครื่องรูดบัตร (EDC) ภายนอก การตรวจสอบสถานะการชำระเงินอัตโนมัติผ่าน API ของธนาคาร การพัฒนาแอปพลิเคชันแบบ Mobile Native การเชื่อมต่อระบบ ERP หรือซัพพลายเออร์ภายนอกแบบอัตโนมัติ และการแจ้งเตือนผ่านบริการภายนอก เช่น LINE Notify หรือ Email ส่วนโมดูล AI-Assisted ถือเป็น Future Work ที่ไม่อยู่ในขอบเขตของโครงงานนี้</w:t>
+        <w:t xml:space="preserve">1.6.1 ร้านวัสดุก่อสร้างอำพรคอนกรีต ซึ่งเป็นสถานประกอบการที่ให้ความอนุเคราะห์เป็นพื้นที่ทดสอบนวัตกรรม (Sandbox) ของโครงงาน โดยแบ่งพื้นที่การทดสอบออกเป็น 3 ส่วน ได้แก่</w:t>
+      </w:r>
+    </w:p>
+    <w:p>
+      <w:pPr>
+        <w:pStyle w:val="BodyText"/>
+      </w:pPr>
+      <w:r>
+        <w:t xml:space="preserve">(1) พื้นที่หน้าร้าน (Storefront) สำหรับทดสอบระบบส่วนติดต่อพนักงานขาย (Sales UI) การสร้างคำสั่งซื้อ การแสดง QR พร้อมเพย์เพื่อรับชำระเงิน และความเสถียรของเครื่องพิมพ์ใบเสร็จ</w:t>
+      </w:r>
+    </w:p>
+    <w:p>
+      <w:pPr>
+        <w:pStyle w:val="BodyText"/>
+      </w:pPr>
+      <w:r>
+        <w:t xml:space="preserve">(2) พื้นที่คลังสินค้าและจุดจ่ายของ (Warehouse &amp; Loading Zone) สำหรับทดสอบระบบส่วนติดต่อพนักงานคลังสินค้า (Warehouse UI) การแสดงคิวงานเรียลไทม์ และการยืนยันจ่ายสินค้าพร้อมตัดยอดสินค้า</w:t>
+      </w:r>
+    </w:p>
+    <w:p>
+      <w:pPr>
+        <w:pStyle w:val="BodyText"/>
+      </w:pPr>
+      <w:r>
+        <w:t xml:space="preserve">(3) พื้นที่สำนักงาน (Back Office) สำหรับทดสอบการแสดงผลของ Operational Dashboard ความถูกต้องของระบบ Audit Logs และความเสถียรของระบบแจ้งเตือนภายในแอปพลิเคชันสำหรับผู้บริหาร</w:t>
       </w:r>
     </w:p>
     <w:bookmarkEnd w:id="21"/>
-    <w:bookmarkEnd w:id="22"/>
-    <w:bookmarkStart w:id="42" w:name="สมมตฐานของโครงงานวศวกรรม"/>
-    <w:p>
-      <w:pPr>
-        <w:pStyle w:val="Heading2"/>
-      </w:pPr>
-      <w:r>
-        <w:t xml:space="preserve">1.4 สมมติฐานของโครงงานวิศวกรรม</w:t>
-      </w:r>
-    </w:p>
-    <w:bookmarkStart w:id="25" w:name="X6c45b262d3e01ab68b3da831d7eb3bda5aa27c4"/>
-    <w:p>
-      <w:pPr>
-        <w:pStyle w:val="Heading3"/>
-      </w:pPr>
-      <w:r>
-        <w:t xml:space="preserve">1.4.1 สถาปัตยกรรมระบบแบบ 3 ชั้น (3-Tier Architecture)</w:t>
-      </w:r>
-    </w:p>
-    <w:bookmarkStart w:id="23" w:name="section-10"/>
-    <w:p>
-      <w:pPr>
-        <w:pStyle w:val="Heading4"/>
-      </w:pPr>
-      <w:r>
-        <w:t xml:space="preserve">1.4.1.1</w:t>
-      </w:r>
-    </w:p>
-    <w:p>
-      <w:pPr>
-        <w:pStyle w:val="FirstParagraph"/>
-      </w:pPr>
-      <w:r>
-        <w:t xml:space="preserve">ระบบถูกออกแบบแยกส่วนประกอบออกเป็น Presentation Layer, Application/Business Logic Layer และ Data Layer ตามหลักการแยกความรับผิดชอบ (Separation of Concerns)</w:t>
-      </w:r>
-    </w:p>
-    <w:bookmarkEnd w:id="23"/>
-    <w:bookmarkStart w:id="24" w:name="section-11"/>
-    <w:p>
-      <w:pPr>
-        <w:pStyle w:val="Heading4"/>
-      </w:pPr>
-      <w:r>
-        <w:t xml:space="preserve">1.4.1.2</w:t>
-      </w:r>
-    </w:p>
-    <w:p>
-      <w:pPr>
-        <w:pStyle w:val="FirstParagraph"/>
-      </w:pPr>
-      <w:r>
-        <w:t xml:space="preserve">การแยกส่วนดังกล่าวช่วยให้การพัฒนา การทดสอบ และการบำรุงรักษาระบบในระยะยาวทำได้ง่ายและเป็นระบบมากขึ้น โดยทวนสอบได้จากการที่แต่ละส่วนประกอบสามารถทดสอบแยกจากกันได้โดยไม่ต้องเปิดระบบทั้งหมด</w:t>
-      </w:r>
-    </w:p>
-    <w:bookmarkEnd w:id="24"/>
-    <w:bookmarkEnd w:id="25"/>
-    <w:bookmarkStart w:id="28" w:name="ระบบฐานขอมลและคณสมบต-acid"/>
-    <w:p>
-      <w:pPr>
-        <w:pStyle w:val="Heading3"/>
-      </w:pPr>
-      <w:r>
-        <w:t xml:space="preserve">1.4.2 ระบบฐานข้อมูลและคุณสมบัติ ACID</w:t>
-      </w:r>
-    </w:p>
-    <w:bookmarkStart w:id="26" w:name="section-12"/>
-    <w:p>
-      <w:pPr>
-        <w:pStyle w:val="Heading4"/>
-      </w:pPr>
-      <w:r>
-        <w:t xml:space="preserve">1.4.2.1</w:t>
-      </w:r>
-    </w:p>
-    <w:p>
-      <w:pPr>
-        <w:pStyle w:val="FirstParagraph"/>
-      </w:pPr>
-      <w:r>
-        <w:t xml:space="preserve">ใช้ฐานข้อมูลเชิงสัมพันธ์ (MySQL) ควบคุมด้วยหลักการ ACID (Atomicity, Consistency, Isolation, Durability) เพื่อรับประกันความสมบูรณ์ของข้อมูลสต็อก</w:t>
-      </w:r>
-    </w:p>
-    <w:bookmarkEnd w:id="26"/>
-    <w:bookmarkStart w:id="27" w:name="section-13"/>
-    <w:p>
-      <w:pPr>
-        <w:pStyle w:val="Heading4"/>
-      </w:pPr>
-      <w:r>
-        <w:t xml:space="preserve">1.4.2.2</w:t>
-      </w:r>
-    </w:p>
-    <w:p>
-      <w:pPr>
-        <w:pStyle w:val="FirstParagraph"/>
-      </w:pPr>
-      <w:r>
-        <w:t xml:space="preserve">ธุรกรรมการตัดสต็อกทำงานแบบอะตอมมิก (Atomic Transaction) เพื่อป้องกันภาวะ Race Condition เมื่อมีการยืนยันจ่ายสินค้าพร้อมกันหลายรายการ และเมื่อธุรกรรมล้มเหลวกลางคัน การเปลี่ยนแปลงที่ทำไปแล้วบางส่วนต้องถูกย้อนกลับทั้งหมด</w:t>
-      </w:r>
-    </w:p>
-    <w:bookmarkEnd w:id="27"/>
-    <w:bookmarkEnd w:id="28"/>
-    <w:bookmarkStart w:id="31" w:name="การควบคมสถานะคำสงซอ-order-status-control"/>
-    <w:p>
-      <w:pPr>
-        <w:pStyle w:val="Heading3"/>
-      </w:pPr>
-      <w:r>
-        <w:t xml:space="preserve">1.4.3 การควบคุมสถานะคำสั่งซื้อ (Order Status Control)</w:t>
-      </w:r>
-    </w:p>
-    <w:bookmarkStart w:id="29" w:name="section-14"/>
-    <w:p>
-      <w:pPr>
-        <w:pStyle w:val="Heading4"/>
-      </w:pPr>
-      <w:r>
-        <w:t xml:space="preserve">1.4.3.1</w:t>
-      </w:r>
-    </w:p>
-    <w:p>
-      <w:pPr>
-        <w:pStyle w:val="FirstParagraph"/>
-      </w:pPr>
-      <w:r>
-        <w:t xml:space="preserve">ระบบใช้แนวคิดการจัดการสถานะข้อมูล (State Management) กำกับวงจรชีวิตของคำสั่งซื้อ ตั้งแต่สถานะ</w:t>
-      </w:r>
-      <w:r>
-        <w:t xml:space="preserve"> </w:t>
-      </w:r>
-      <w:r>
-        <w:t xml:space="preserve">“รอจ่ายสินค้า”</w:t>
-      </w:r>
-      <w:r>
-        <w:t xml:space="preserve"> </w:t>
-      </w:r>
-      <w:r>
-        <w:t xml:space="preserve">จนถึง</w:t>
-      </w:r>
-      <w:r>
-        <w:t xml:space="preserve"> </w:t>
-      </w:r>
-      <w:r>
-        <w:t xml:space="preserve">“ส่งมอบสำเร็จ”</w:t>
-      </w:r>
-    </w:p>
-    <w:bookmarkEnd w:id="29"/>
-    <w:bookmarkStart w:id="30" w:name="section-15"/>
-    <w:p>
-      <w:pPr>
-        <w:pStyle w:val="Heading4"/>
-      </w:pPr>
-      <w:r>
-        <w:t xml:space="preserve">1.4.3.2</w:t>
-      </w:r>
-    </w:p>
-    <w:p>
-      <w:pPr>
-        <w:pStyle w:val="FirstParagraph"/>
-      </w:pPr>
-      <w:r>
-        <w:t xml:space="preserve">เมื่อพนักงานคลังสินค้ากดยืนยันจ่ายสินค้าแล้ว ระบบจะเปลี่ยนสถานะคำสั่งซื้อทันที และไม่แสดงในคิวรอจ่ายอีกต่อไป เพื่อป้องกันการรับสินค้าซ้ำ โดยไม่ต้องอาศัยการสแกนรหัสยืนยันเพิ่มเติม</w:t>
-      </w:r>
-    </w:p>
-    <w:bookmarkEnd w:id="30"/>
-    <w:bookmarkEnd w:id="31"/>
-    <w:bookmarkStart w:id="34" w:name="X951687ef2c64f4ad26e3e661a119d01a9a60ae5"/>
-    <w:p>
-      <w:pPr>
-        <w:pStyle w:val="Heading3"/>
-      </w:pPr>
-      <w:r>
-        <w:t xml:space="preserve">1.4.4 การสื่อสารข้อมูลแบบเรียลไทม์ (Event-Driven Communication)</w:t>
-      </w:r>
-    </w:p>
-    <w:bookmarkStart w:id="32" w:name="section-16"/>
-    <w:p>
-      <w:pPr>
-        <w:pStyle w:val="Heading4"/>
-      </w:pPr>
-      <w:r>
-        <w:t xml:space="preserve">1.4.4.1</w:t>
-      </w:r>
-    </w:p>
-    <w:p>
-      <w:pPr>
-        <w:pStyle w:val="FirstParagraph"/>
-      </w:pPr>
-      <w:r>
-        <w:t xml:space="preserve">เมื่อมีการยืนยันคำสั่งซื้อที่หน้าร้าน ข้อมูลจะถูกผลัก (Push) ไปยังหน้าจอคิวคลังสินค้าทันที โดยพนักงานไม่จำเป็นต้องกดรีเฟรชหน้าจอ และไม่ต้องให้หน้าจอวนถามข้อมูลเป็นระยะ (Polling)</w:t>
-      </w:r>
-    </w:p>
-    <w:bookmarkEnd w:id="32"/>
-    <w:bookmarkStart w:id="33" w:name="section-17"/>
-    <w:p>
-      <w:pPr>
-        <w:pStyle w:val="Heading4"/>
-      </w:pPr>
-      <w:r>
-        <w:t xml:space="preserve">1.4.4.2</w:t>
-      </w:r>
-    </w:p>
-    <w:p>
-      <w:pPr>
-        <w:pStyle w:val="FirstParagraph"/>
-      </w:pPr>
-      <w:r>
-        <w:t xml:space="preserve">พนักงานคลังสินค้าสามารถทราบและเริ่มจัดเตรียมสินค้าได้ก่อนที่ลูกค้าจะเดินถือใบเสร็จมาถึงจุดรับของ</w:t>
-      </w:r>
-    </w:p>
-    <w:bookmarkEnd w:id="33"/>
-    <w:bookmarkEnd w:id="34"/>
-    <w:bookmarkStart w:id="37" w:name="Xcf2c9c4bec6e1a4096a5f6228cbb22e5db80628"/>
-    <w:p>
-      <w:pPr>
-        <w:pStyle w:val="Heading3"/>
-      </w:pPr>
-      <w:r>
-        <w:t xml:space="preserve">1.4.5 การนำเสนอข้อมูลเชิงปฏิบัติการ (Operational Dashboard &amp; In-App Alerts)</w:t>
-      </w:r>
-    </w:p>
-    <w:bookmarkStart w:id="35" w:name="section-18"/>
-    <w:p>
-      <w:pPr>
-        <w:pStyle w:val="Heading4"/>
-      </w:pPr>
-      <w:r>
-        <w:t xml:space="preserve">1.4.5.1</w:t>
-      </w:r>
-    </w:p>
-    <w:p>
-      <w:pPr>
-        <w:pStyle w:val="FirstParagraph"/>
-      </w:pPr>
-      <w:r>
-        <w:t xml:space="preserve">ระบบรวบรวมข้อมูลธุรกรรม (Data Aggregation) จากหลายแหล่งมาแสดงผลผ่าน Operational Dashboard ให้ผู้บริหารมองเห็นภาพรวมแบบเรียลไทม์</w:t>
-      </w:r>
-    </w:p>
-    <w:bookmarkEnd w:id="35"/>
-    <w:bookmarkStart w:id="36" w:name="section-19"/>
-    <w:p>
-      <w:pPr>
-        <w:pStyle w:val="Heading4"/>
-      </w:pPr>
-      <w:r>
-        <w:t xml:space="preserve">1.4.5.2</w:t>
-      </w:r>
-    </w:p>
-    <w:p>
-      <w:pPr>
-        <w:pStyle w:val="FirstParagraph"/>
-      </w:pPr>
-      <w:r>
-        <w:t xml:space="preserve">ระบบแจ้งเตือนภายในแอปพลิเคชัน (In-App Notification) เมื่อสต็อกต่ำกว่าจุดสั่งซื้อเพิ่ม (Reorder Point) หรือมีคิวงานค้างนานผิดปกติ โดยไม่พึ่งพาบริการแจ้งเตือนภายนอก</w:t>
-      </w:r>
-    </w:p>
-    <w:bookmarkEnd w:id="36"/>
-    <w:bookmarkEnd w:id="37"/>
-    <w:bookmarkStart w:id="41" w:name="ผลลพธทคาดหวงจากการนำระบบไปใช"/>
-    <w:p>
-      <w:pPr>
-        <w:pStyle w:val="Heading3"/>
-      </w:pPr>
-      <w:r>
-        <w:t xml:space="preserve">1.4.6 ผลลัพธ์ที่คาดหวังจากการนำระบบไปใช้</w:t>
-      </w:r>
-    </w:p>
-    <w:bookmarkStart w:id="38" w:name="section-20"/>
-    <w:p>
-      <w:pPr>
-        <w:pStyle w:val="Heading4"/>
-      </w:pPr>
-      <w:r>
-        <w:t xml:space="preserve">1.4.6.1</w:t>
-      </w:r>
-    </w:p>
-    <w:p>
-      <w:pPr>
-        <w:pStyle w:val="FirstParagraph"/>
-      </w:pPr>
-      <w:r>
-        <w:t xml:space="preserve">การส่งคำสั่งซื้อเข้าคิวงานคลังสินค้าแบบเรียลไทม์ทันทีที่ชำระเงิน จะช่วยลดข้อผิดพลาดในการหยิบสินค้า เนื่องจากพนักงานอ่านรายการจากหน้าจอที่ระบบสร้างขึ้นแทนการอ่านลายมือบนใบเสร็จ และทำให้กระบวนการส่งมอบรวดเร็วขึ้นเพราะการจัดเตรียมสินค้าเริ่มได้ก่อนลูกค้าเดินมาถึงจุดรับของ</w:t>
-      </w:r>
-    </w:p>
-    <w:bookmarkEnd w:id="38"/>
-    <w:bookmarkStart w:id="39" w:name="section-21"/>
-    <w:p>
-      <w:pPr>
-        <w:pStyle w:val="Heading4"/>
-      </w:pPr>
-      <w:r>
-        <w:t xml:space="preserve">1.4.6.2</w:t>
-      </w:r>
-    </w:p>
-    <w:p>
-      <w:pPr>
-        <w:pStyle w:val="FirstParagraph"/>
-      </w:pPr>
-      <w:r>
-        <w:t xml:space="preserve">การให้พนักงานยืนยันจ่ายสินค้าผ่านหน้าจอคิวงานเพื่อตัดสต็อกอัตโนมัติ จะทำให้ตัวเลขสต็อกในระบบตรงกับจำนวนสินค้าที่มีอยู่จริงในคลัง โดยตั้งเกณฑ์ว่าต้องไม่เกิดผลต่างที่มีสาเหตุจากตัวระบบเอง ซึ่งทวนสอบได้ด้วยการนับสินค้าจริงเปรียบเทียบกับยอดในระบบ</w:t>
-      </w:r>
-    </w:p>
-    <w:bookmarkEnd w:id="39"/>
-    <w:bookmarkStart w:id="40" w:name="section-22"/>
-    <w:p>
-      <w:pPr>
-        <w:pStyle w:val="Heading4"/>
-      </w:pPr>
-      <w:r>
-        <w:t xml:space="preserve">1.4.6.3</w:t>
-      </w:r>
-    </w:p>
-    <w:p>
-      <w:pPr>
-        <w:pStyle w:val="FirstParagraph"/>
-      </w:pPr>
-      <w:r>
-        <w:t xml:space="preserve">การใช้ Operational Dashboard และระบบแจ้งเตือนภายในแอปพลิเคชัน จะช่วยให้ผู้บริหารมีข้อมูลจริง (Data-Driven) ในการวางแผนสั่งซื้อสินค้า ลดปัญหาสินค้าขาดมือและสินค้าค้างสต็อกที่เกิดจากการสั่งซื้อด้วยประสบการณ์เพียงอย่างเดียว</w:t>
-      </w:r>
-    </w:p>
-    <w:bookmarkEnd w:id="40"/>
-    <w:bookmarkEnd w:id="41"/>
-    <w:bookmarkEnd w:id="42"/>
-    <w:bookmarkStart w:id="46" w:name="ประโยชนทคาดวาจะไดรบ"/>
-    <w:p>
-      <w:pPr>
-        <w:pStyle w:val="Heading2"/>
-      </w:pPr>
-      <w:r>
-        <w:t xml:space="preserve">1.5 ประโยชน์ที่คาดว่าจะได้รับ</w:t>
-      </w:r>
-    </w:p>
-    <w:bookmarkStart w:id="43" w:name="section-23"/>
-    <w:p>
-      <w:pPr>
-        <w:pStyle w:val="Heading3"/>
-      </w:pPr>
-      <w:r>
-        <w:t xml:space="preserve">1.5.1</w:t>
-      </w:r>
-    </w:p>
-    <w:p>
-      <w:pPr>
-        <w:pStyle w:val="FirstParagraph"/>
-      </w:pPr>
-      <w:r>
-        <w:t xml:space="preserve">ลดระยะเวลารอคอย (Lead Time Reduction) โดยลดคอขวดระหว่างหน้าร้านและคลังสินค้าผ่านระบบคิวเรียลไทม์ ทำให้คลังสินค้าสามารถจัดเตรียมวัสดุล่วงหน้าได้ทันทีที่รับชำระเงิน</w:t>
-      </w:r>
-    </w:p>
-    <w:bookmarkEnd w:id="43"/>
-    <w:bookmarkStart w:id="44" w:name="section-24"/>
-    <w:p>
-      <w:pPr>
-        <w:pStyle w:val="Heading3"/>
-      </w:pPr>
-      <w:r>
-        <w:t xml:space="preserve">1.5.2</w:t>
-      </w:r>
-    </w:p>
-    <w:p>
-      <w:pPr>
-        <w:pStyle w:val="FirstParagraph"/>
-      </w:pPr>
-      <w:r>
-        <w:t xml:space="preserve">ลดข้อผิดพลาดที่เกิดจากมนุษย์ (Human Error Reduction) โดยลดความเสี่ยงจากการอ่านเอกสารกระดาษผิดพลาด ระบบส่งรายละเอียดคำสั่งซื้อไปยังหน้าจอคลังสินค้าโดยตรงแบบเรียลไทม์ พนักงานจึงเตรียมและตรวจสอบสินค้าจากข้อมูลบนหน้าจอระบบ แทนการอ่านใบเสร็จด้วยสายตาเพียงอย่างเดียว</w:t>
-      </w:r>
-    </w:p>
-    <w:bookmarkEnd w:id="44"/>
-    <w:bookmarkStart w:id="45" w:name="section-25"/>
-    <w:p>
-      <w:pPr>
-        <w:pStyle w:val="Heading3"/>
-      </w:pPr>
-      <w:r>
-        <w:t xml:space="preserve">1.5.3</w:t>
-      </w:r>
-    </w:p>
-    <w:p>
-      <w:pPr>
-        <w:pStyle w:val="FirstParagraph"/>
-      </w:pPr>
-      <w:r>
-        <w:t xml:space="preserve">เพิ่มความสมบูรณ์ของข้อมูล (Data Integrity) โดยยอดสินค้าคงเหลือในระบบสะท้อนจำนวนสินค้าจริงในคลังอย่างแม่นยำ พร้อมทั้งสามารถตรวจสอบย้อนหลัง (Traceability) ได้ทุกรายการ ซึ่งเป็นรากฐานให้ผู้บริหารสามารถวางแผนสั่งซื้อสินค้าจากข้อมูลจริง แทนการใช้ประสบการณ์และสัญชาตญาณ</w:t>
-      </w:r>
-    </w:p>
-    <w:bookmarkEnd w:id="45"/>
-    <w:bookmarkEnd w:id="46"/>
-    <w:bookmarkStart w:id="48" w:name="สถานทจดทำโครงงาน"/>
-    <w:p>
-      <w:pPr>
-        <w:pStyle w:val="Heading2"/>
-      </w:pPr>
-      <w:r>
-        <w:t xml:space="preserve">1.6 สถานที่จัดทำโครงงาน</w:t>
-      </w:r>
-    </w:p>
-    <w:bookmarkStart w:id="47" w:name="section-26"/>
-    <w:p>
-      <w:pPr>
-        <w:pStyle w:val="Heading3"/>
-      </w:pPr>
-      <w:r>
-        <w:t xml:space="preserve">1.6.1</w:t>
-      </w:r>
-    </w:p>
-    <w:p>
-      <w:pPr>
-        <w:pStyle w:val="FirstParagraph"/>
-      </w:pPr>
-      <w:r>
-        <w:t xml:space="preserve">ร้านวัสดุก่อสร้างอำพรคอนกรีต ซึ่งเป็นสถานประกอบการที่ให้ความอนุเคราะห์เป็นพื้นที่ทดสอบนวัตกรรม (Sandbox) ของโครงงาน โดยแบ่งพื้นที่การทดสอบออกเป็น 3 ส่วน ได้แก่</w:t>
-      </w:r>
-    </w:p>
-    <w:p>
-      <w:pPr>
-        <w:numPr>
-          <w:ilvl w:val="0"/>
-          <w:numId w:val="1001"/>
-        </w:numPr>
-      </w:pPr>
-      <w:r>
-        <w:t xml:space="preserve">พื้นที่หน้าร้าน (Storefront) สำหรับทดสอบระบบส่วนติดต่อพนักงานขาย (Sales UI) การสร้างคำสั่งซื้อ การแสดง QR พร้อมเพย์เพื่อรับชำระเงิน และความเสถียรของเครื่องพิมพ์ใบเสร็จ</w:t>
-      </w:r>
-    </w:p>
-    <w:p>
-      <w:pPr>
-        <w:numPr>
-          <w:ilvl w:val="0"/>
-          <w:numId w:val="1001"/>
-        </w:numPr>
-      </w:pPr>
-      <w:r>
-        <w:t xml:space="preserve">พื้นที่คลังสินค้าและจุดจ่ายของ (Warehouse &amp; Loading Zone) สำหรับทดสอบระบบส่วนติดต่อพนักงานคลังสินค้า (Warehouse UI) การแสดงคิวงานเรียลไทม์ และการยืนยันจ่ายสินค้าพร้อมตัดยอดสินค้า</w:t>
-      </w:r>
-    </w:p>
-    <w:p>
-      <w:pPr>
-        <w:numPr>
-          <w:ilvl w:val="0"/>
-          <w:numId w:val="1001"/>
-        </w:numPr>
-      </w:pPr>
-      <w:r>
-        <w:t xml:space="preserve">พื้นที่สำนักงาน (Back Office) สำหรับทดสอบการแสดงผลของ Operational Dashboard ความถูกต้องของระบบ Audit Logs และความเสถียรของระบบแจ้งเตือนภายในแอปพลิเคชันสำหรับผู้บริหาร</w:t>
-      </w:r>
-    </w:p>
-    <w:bookmarkEnd w:id="47"/>
-    <w:bookmarkEnd w:id="48"/>
-    <w:bookmarkStart w:id="49" w:name="ตารางแผนการดำเนนงาน"/>
+    <w:bookmarkStart w:id="22" w:name="ตารางแผนการดำเนนงาน"/>
     <w:p>
       <w:pPr>
         <w:pStyle w:val="Heading2"/>
@@ -1193,8 +914,8 @@
         <w:t xml:space="preserve">ตารางแผนการดำเนินงานนี้แสดงให้เห็นว่าโครงงานมีการวางแผนดำเนินงานอย่างเป็นขั้นตอน ตั้งแต่การวิเคราะห์ความต้องการจนถึงการทดสอบและประเมินผล ครอบคลุมระยะเวลารวม 6 เดือน ซึ่งช่วยให้ทีมงานสามารถติดตามความก้าวหน้าและควบคุมการทำงานของโครงงานได้อย่างมีระบบ</w:t>
       </w:r>
     </w:p>
-    <w:bookmarkEnd w:id="49"/>
-    <w:bookmarkEnd w:id="50"/>
+    <w:bookmarkEnd w:id="22"/>
+    <w:bookmarkEnd w:id="23"/>
     <w:sectPr>
       <w:headerReference r:id="rIdHdrNum" w:type="default"/>
       <w:headerReference r:id="rIdHdrFirst" w:type="first"/>
@@ -1359,123 +1080,8 @@
       </w:pPr>
     </w:lvl>
   </w:abstractNum>
-  <w:abstractNum w:abstractNumId="99421">
-    <w:nsid w:val="00A99421"/>
-    <w:multiLevelType w:val="multilevel"/>
-    <w:lvl w:ilvl="0">
-      <w:start w:val="1"/>
-      <w:numFmt w:val="decimal"/>
-      <w:lvlText w:val="%1)"/>
-      <w:lvlJc w:val="left"/>
-      <w:pPr>
-        <w:ind w:left="720" w:hanging="360"/>
-      </w:pPr>
-    </w:lvl>
-    <w:lvl w:ilvl="1">
-      <w:start w:val="1"/>
-      <w:numFmt w:val="decimal"/>
-      <w:lvlText w:val="%2)"/>
-      <w:lvlJc w:val="left"/>
-      <w:pPr>
-        <w:ind w:left="1440" w:hanging="360"/>
-      </w:pPr>
-    </w:lvl>
-    <w:lvl w:ilvl="2">
-      <w:start w:val="1"/>
-      <w:numFmt w:val="decimal"/>
-      <w:lvlText w:val="%3)"/>
-      <w:lvlJc w:val="left"/>
-      <w:pPr>
-        <w:ind w:left="2160" w:hanging="360"/>
-      </w:pPr>
-    </w:lvl>
-    <w:lvl w:ilvl="3">
-      <w:start w:val="1"/>
-      <w:numFmt w:val="decimal"/>
-      <w:lvlText w:val="%4)"/>
-      <w:lvlJc w:val="left"/>
-      <w:pPr>
-        <w:ind w:left="2880" w:hanging="360"/>
-      </w:pPr>
-    </w:lvl>
-    <w:lvl w:ilvl="4">
-      <w:start w:val="1"/>
-      <w:numFmt w:val="decimal"/>
-      <w:lvlText w:val="%5)"/>
-      <w:lvlJc w:val="left"/>
-      <w:pPr>
-        <w:ind w:left="3600" w:hanging="360"/>
-      </w:pPr>
-    </w:lvl>
-    <w:lvl w:ilvl="5">
-      <w:start w:val="1"/>
-      <w:numFmt w:val="decimal"/>
-      <w:lvlText w:val="%6)"/>
-      <w:lvlJc w:val="left"/>
-      <w:pPr>
-        <w:ind w:left="4320" w:hanging="360"/>
-      </w:pPr>
-    </w:lvl>
-    <w:lvl w:ilvl="6">
-      <w:start w:val="1"/>
-      <w:numFmt w:val="decimal"/>
-      <w:lvlText w:val="%7)"/>
-      <w:lvlJc w:val="left"/>
-      <w:pPr>
-        <w:ind w:left="5040" w:hanging="360"/>
-      </w:pPr>
-    </w:lvl>
-    <w:lvl w:ilvl="7">
-      <w:start w:val="1"/>
-      <w:numFmt w:val="decimal"/>
-      <w:lvlText w:val="%8)"/>
-      <w:lvlJc w:val="left"/>
-      <w:pPr>
-        <w:ind w:left="5760" w:hanging="360"/>
-      </w:pPr>
-    </w:lvl>
-    <w:lvl w:ilvl="8">
-      <w:start w:val="1"/>
-      <w:numFmt w:val="decimal"/>
-      <w:lvlText w:val="%9)"/>
-      <w:lvlJc w:val="left"/>
-      <w:pPr>
-        <w:ind w:left="6480" w:hanging="360"/>
-      </w:pPr>
-    </w:lvl>
-  </w:abstractNum>
   <w:num w:numId="1000">
     <w:abstractNumId w:val="990"/>
-  </w:num>
-  <w:num w:numId="1001">
-    <w:abstractNumId w:val="99421"/>
-    <w:lvlOverride w:ilvl="0">
-      <w:startOverride w:val="1"/>
-    </w:lvlOverride>
-    <w:lvlOverride w:ilvl="1">
-      <w:startOverride w:val="1"/>
-    </w:lvlOverride>
-    <w:lvlOverride w:ilvl="2">
-      <w:startOverride w:val="1"/>
-    </w:lvlOverride>
-    <w:lvlOverride w:ilvl="3">
-      <w:startOverride w:val="1"/>
-    </w:lvlOverride>
-    <w:lvlOverride w:ilvl="4">
-      <w:startOverride w:val="1"/>
-    </w:lvlOverride>
-    <w:lvlOverride w:ilvl="5">
-      <w:startOverride w:val="1"/>
-    </w:lvlOverride>
-    <w:lvlOverride w:ilvl="6">
-      <w:startOverride w:val="1"/>
-    </w:lvlOverride>
-    <w:lvlOverride w:ilvl="7">
-      <w:startOverride w:val="1"/>
-    </w:lvlOverride>
-    <w:lvlOverride w:ilvl="8">
-      <w:startOverride w:val="1"/>
-    </w:lvlOverride>
   </w:num>
 </w:numbering>
 </file>

</xml_diff>

<commit_message>
Make the right edge actually line up
The manual asks for Thai distributed justification, so the styles carried
w:jc="thaiDistribute". Word honours it; the renderer that produces our PDFs
does not, and left every line ending wherever its last word fell — up to a
fifth of an inch short of the right margin.

Switched to w:jc="both", which both Word and the PDF renderer justify the
same way. Measured against the page: body lines now end at the right margin
to within a point.

Co-Authored-By: Claude Opus 5 <noreply@anthropic.com>
Claude-Session: https://claude.ai/code/session_01VK1RWMhqrGAHMFf4HNf3qn
</commit_message>
<xml_diff>
--- a/Documents/รูปเล่ม/บทที่1_ฉบับตรวจแก้.docx
+++ b/Documents/รูปเล่ม/บทที่1_ฉบับตรวจแก้.docx
@@ -1573,7 +1573,7 @@
     <w:name w:val="Normal"/>
     <w:qFormat/>
     <w:pPr>
-      <w:jc w:val="thaiDistribute"/>
+      <w:jc w:val="both"/>
       <w:ind w:firstLine="720"/>
     </w:pPr>
     <w:rPr>
@@ -1587,7 +1587,7 @@
     <w:basedOn w:val="Normal"/>
     <w:qFormat/>
     <w:pPr>
-      <w:jc w:val="thaiDistribute"/>
+      <w:jc w:val="both"/>
       <w:ind w:firstLine="720"/>
     </w:pPr>
   </w:style>
@@ -1596,7 +1596,7 @@
     <w:basedOn w:val="Normal"/>
     <w:qFormat/>
     <w:pPr>
-      <w:jc w:val="thaiDistribute"/>
+      <w:jc w:val="both"/>
       <w:ind w:firstLine="720"/>
     </w:pPr>
   </w:style>

</xml_diff>